<commit_message>
docs: remove developer notes from presentation title slide and add dedicated workflow diagram document PDF
</commit_message>
<xml_diff>
--- a/submission/FORM_SUBMISSION_FIELD_ANSWERS.docx
+++ b/submission/FORM_SUBMISSION_FIELD_ANSWERS.docx
@@ -4,923 +4,368 @@
   <w:body>
     <w:p>
       <w:pPr>
-        <w:jc w:val="center"/>
+        <w:pStyle w:val="Heading1"/>
       </w:pPr>
       <w:r>
-        <w:rPr>
-          <w:rFonts w:ascii="Calibri" w:hAnsi="Calibri"/>
-          <w:b/>
-          <w:color w:val="0F2043"/>
-          <w:sz w:val="44"/>
-        </w:rPr>
         <w:t>Sentinel — Hackathon Submission Form Answers</w:t>
       </w:r>
     </w:p>
+    <w:p/>
     <w:p>
-      <w:pPr>
-        <w:jc w:val="center"/>
-      </w:pPr>
       <w:r>
-        <w:rPr>
-          <w:rFonts w:ascii="Calibri" w:hAnsi="Calibri"/>
-          <w:i/>
-          <w:color w:val="646E78"/>
-          <w:sz w:val="24"/>
-        </w:rPr>
-        <w:t>Gujarat CCTV Integration Hackathon 2026 · Category 1</w:t>
-        <w:br/>
-        <w:t>Copy-Paste Answers Cheat Sheet</w:t>
+        <w:t>Use this guide to copy-paste exact, professional responses into each field of the Google Form.</w:t>
       </w:r>
     </w:p>
     <w:p/>
-    <w:tbl>
-      <w:tblPr>
-        <w:tblW w:type="auto" w:w="0"/>
-        <w:tblLook w:firstColumn="1" w:firstRow="1" w:lastColumn="0" w:lastRow="0" w:noHBand="0" w:noVBand="1" w:val="04A0"/>
-      </w:tblPr>
-      <w:tblGrid>
-        <w:gridCol w:w="9936"/>
-      </w:tblGrid>
-      <w:tr>
-        <w:tc>
-          <w:tcPr>
-            <w:tcW w:type="dxa" w:w="9936"/>
-            <w:shd w:val="clear" w:color="auto" w:fill="F8F9FA"/>
-          </w:tcPr>
-          <w:p>
-            <w:pPr>
-              <w:spacing w:before="120" w:after="120"/>
-            </w:pPr>
-            <w:r>
-              <w:rPr>
-                <w:rFonts w:ascii="Segoe UI" w:hAnsi="Segoe UI"/>
-                <w:color w:val="141414"/>
-                <w:sz w:val="21"/>
-              </w:rPr>
-              <w:t>Use this guide to copy-paste exact, professional responses into each field of the Google Form.</w:t>
-            </w:r>
-          </w:p>
-        </w:tc>
-      </w:tr>
-    </w:tbl>
+    <w:p>
+      <w:r>
+        <w:t>---</w:t>
+      </w:r>
+    </w:p>
     <w:p/>
     <w:p>
       <w:pPr>
-        <w:spacing w:before="280" w:after="120"/>
+        <w:pStyle w:val="Heading2"/>
       </w:pPr>
       <w:r>
-        <w:rPr>
-          <w:rFonts w:ascii="Calibri" w:hAnsi="Calibri"/>
-          <w:b/>
-          <w:color w:val="1C366E"/>
-          <w:sz w:val="32"/>
-        </w:rPr>
         <w:t>1. Project Description</w:t>
       </w:r>
     </w:p>
+    <w:p/>
     <w:p>
       <w:pPr>
-        <w:spacing w:before="200" w:after="80"/>
+        <w:pStyle w:val="Heading3"/>
       </w:pPr>
       <w:r>
-        <w:rPr>
-          <w:rFonts w:ascii="Calibri" w:hAnsi="Calibri"/>
-          <w:b/>
-          <w:color w:val="1E283C"/>
-          <w:sz w:val="26"/>
-        </w:rPr>
         <w:t>Proposed Solution *</w:t>
       </w:r>
     </w:p>
-    <w:tbl>
-      <w:tblPr>
-        <w:tblW w:type="auto" w:w="0"/>
-        <w:tblLook w:firstColumn="1" w:firstRow="1" w:lastColumn="0" w:lastRow="0" w:noHBand="0" w:noVBand="1" w:val="04A0"/>
-      </w:tblPr>
-      <w:tblGrid>
-        <w:gridCol w:w="9936"/>
-      </w:tblGrid>
-      <w:tr>
-        <w:tc>
-          <w:tcPr>
-            <w:tcW w:type="dxa" w:w="9936"/>
-            <w:shd w:val="clear" w:color="auto" w:fill="F8F9FA"/>
-          </w:tcPr>
-          <w:p>
-            <w:pPr>
-              <w:spacing w:before="120" w:after="120"/>
-            </w:pPr>
-            <w:r>
-              <w:rPr>
-                <w:rFonts w:ascii="Segoe UI" w:hAnsi="Segoe UI"/>
-                <w:color w:val="141414"/>
-                <w:sz w:val="21"/>
-              </w:rPr>
-              <w:t>Sentinel is an integrated Statewide CCTV Management &amp; ANPR Surveillance Platform. It ingests live RTSP camera feeds across Gujarat, maps 30 camera nodes on an interactive GIS map, performs continuous license plate detection using YOLOv9 &amp; fast-alpr with Indian plate-grammar correction, enforces real-time watchlist alert notifications via WebSockets, reconstructs vehicle travel routes across camera locations, and provides audited XLSX/PDF evidence exports.</w:t>
-            </w:r>
-          </w:p>
-        </w:tc>
-      </w:tr>
-    </w:tbl>
+    <w:p>
+      <w:r>
+        <w:t>Sentinel is an integrated Statewide CCTV Management &amp; ANPR Surveillance Platform. It ingests live RTSP camera feeds across Gujarat, maps 30 camera nodes on an interactive GIS map, performs continuous license plate detection using YOLOv9 &amp; fast-alpr with Indian plate-grammar correction, enforces real-time watchlist alert notifications via WebSockets, reconstructs vehicle travel routes across camera locations, and provides audited XLSX/PDF evidence exports.</w:t>
+      </w:r>
+    </w:p>
     <w:p/>
     <w:p>
       <w:pPr>
-        <w:spacing w:before="200" w:after="80"/>
+        <w:pStyle w:val="Heading3"/>
       </w:pPr>
       <w:r>
-        <w:rPr>
-          <w:rFonts w:ascii="Calibri" w:hAnsi="Calibri"/>
-          <w:b/>
-          <w:color w:val="1E283C"/>
-          <w:sz w:val="26"/>
-        </w:rPr>
         <w:t>Key Features * (One per line)</w:t>
       </w:r>
     </w:p>
     <w:p>
-      <w:pPr>
-        <w:pStyle w:val="ListBullet"/>
-      </w:pPr>
       <w:r>
-        <w:rPr>
-          <w:rFonts w:ascii="Calibri" w:hAnsi="Calibri"/>
-          <w:sz w:val="22"/>
-        </w:rPr>
-        <w:t>Live GIS Camera Map with department, status layers &amp; location provenance</w:t>
+        <w:t>- Live GIS Camera Map with department, status layers &amp; location provenance</w:t>
       </w:r>
     </w:p>
     <w:p>
-      <w:pPr>
-        <w:pStyle w:val="ListBullet"/>
-      </w:pPr>
       <w:r>
-        <w:rPr>
-          <w:rFonts w:ascii="Calibri" w:hAnsi="Calibri"/>
-          <w:sz w:val="22"/>
-        </w:rPr>
-        <w:t>Real-Time ANPR Pipeline with track-level voting &amp; Indian plate grammar correction</w:t>
+        <w:t>- Real-Time ANPR Pipeline with track-level voting &amp; Indian plate grammar correction</w:t>
       </w:r>
     </w:p>
     <w:p>
-      <w:pPr>
-        <w:pStyle w:val="ListBullet"/>
-      </w:pPr>
       <w:r>
-        <w:rPr>
-          <w:rFonts w:ascii="Calibri" w:hAnsi="Calibri"/>
-          <w:sz w:val="22"/>
-        </w:rPr>
-        <w:t>Low-Resolution Partial Read Guard preventing false-positive alerts</w:t>
+        <w:t>- Low-Resolution Partial Read Guard preventing false-positive alerts</w:t>
       </w:r>
     </w:p>
     <w:p>
-      <w:pPr>
-        <w:pStyle w:val="ListBullet"/>
-      </w:pPr>
       <w:r>
-        <w:rPr>
-          <w:rFonts w:ascii="Calibri" w:hAnsi="Calibri"/>
-          <w:sz w:val="22"/>
-        </w:rPr>
-        <w:t>Watchlist Matching with instant WebSocket alert toasts &amp; acknowledge workflow</w:t>
+        <w:t>- Watchlist Matching with instant WebSocket alert toasts &amp; acknowledge workflow</w:t>
       </w:r>
     </w:p>
     <w:p>
-      <w:pPr>
-        <w:pStyle w:val="ListBullet"/>
-      </w:pPr>
       <w:r>
-        <w:rPr>
-          <w:rFonts w:ascii="Calibri" w:hAnsi="Calibri"/>
-          <w:sz w:val="22"/>
-        </w:rPr>
-        <w:t>Vehicle Route Reconstruction with speed estimation &amp; impossible transition flagging</w:t>
+        <w:t>- Vehicle Route Reconstruction with speed estimation &amp; impossible transition flagging</w:t>
       </w:r>
     </w:p>
     <w:p>
-      <w:pPr>
-        <w:pStyle w:val="ListBullet"/>
-      </w:pPr>
       <w:r>
-        <w:rPr>
-          <w:rFonts w:ascii="Calibri" w:hAnsi="Calibri"/>
-          <w:sz w:val="22"/>
-        </w:rPr>
-        <w:t>Contract-First VAHAN Vehicle Adapter for registration particulars enrichment</w:t>
+        <w:t>- Contract-First VAHAN Vehicle Adapter for registration particulars enrichment</w:t>
       </w:r>
     </w:p>
     <w:p>
+      <w:r>
+        <w:t>- Audited Output Report Exports (XLSX &amp; PDF) with audit trail logging</w:t>
+      </w:r>
+    </w:p>
+    <w:p/>
+    <w:p>
       <w:pPr>
-        <w:pStyle w:val="ListBullet"/>
+        <w:pStyle w:val="Heading3"/>
       </w:pPr>
       <w:r>
-        <w:rPr>
-          <w:rFonts w:ascii="Calibri" w:hAnsi="Calibri"/>
-          <w:sz w:val="22"/>
-        </w:rPr>
-        <w:t>Audited Output Report Exports (XLSX &amp; PDF) with audit trail logging</w:t>
-      </w:r>
-    </w:p>
-    <w:p>
-      <w:pPr>
-        <w:spacing w:before="200" w:after="80"/>
-      </w:pPr>
-      <w:r>
-        <w:rPr>
-          <w:rFonts w:ascii="Calibri" w:hAnsi="Calibri"/>
-          <w:b/>
-          <w:color w:val="1E283C"/>
-          <w:sz w:val="26"/>
-        </w:rPr>
         <w:t>Expected Impact *</w:t>
       </w:r>
     </w:p>
     <w:p>
-      <w:pPr>
-        <w:pStyle w:val="ListBullet"/>
-      </w:pPr>
       <w:r>
-        <w:rPr>
-          <w:rFonts w:ascii="Calibri" w:hAnsi="Calibri"/>
-          <w:sz w:val="22"/>
-        </w:rPr>
-        <w:t>Eliminates false-positive alerts by enforcing Indian plate grammar and resolution thresholds before alert dispatch.</w:t>
+        <w:t>- Eliminates false-positive alerts by enforcing Indian plate grammar and resolution thresholds before alert dispatch.</w:t>
       </w:r>
     </w:p>
     <w:p>
-      <w:pPr>
-        <w:pStyle w:val="ListBullet"/>
-      </w:pPr>
       <w:r>
-        <w:rPr>
-          <w:rFonts w:ascii="Calibri" w:hAnsi="Calibri"/>
-          <w:sz w:val="22"/>
-        </w:rPr>
-        <w:t>Enables automated statewide tracking of stolen and wanted vehicles across multi-camera corridors.</w:t>
+        <w:t>- Enables automated statewide tracking of stolen and wanted vehicles across multi-camera corridors.</w:t>
       </w:r>
     </w:p>
     <w:p>
-      <w:pPr>
-        <w:pStyle w:val="ListBullet"/>
-      </w:pPr>
       <w:r>
-        <w:rPr>
-          <w:rFonts w:ascii="Calibri" w:hAnsi="Calibri"/>
-          <w:sz w:val="22"/>
-        </w:rPr>
-        <w:t>Provides actionable optics insights proving where ANPR is viable (toll plazas/checkposts) vs wide-area overview cameras.</w:t>
+        <w:t>- Provides actionable optics insights proving where ANPR is viable (toll plazas/checkposts) vs wide-area overview cameras.</w:t>
       </w:r>
     </w:p>
     <w:p>
+      <w:r>
+        <w:t>- Establishes end-to-end security compliance with role-based access control (RBAC) and complete audit logging for every citizen search.</w:t>
+      </w:r>
+    </w:p>
+    <w:p/>
+    <w:p>
+      <w:r>
+        <w:t>---</w:t>
+      </w:r>
+    </w:p>
+    <w:p/>
+    <w:p>
       <w:pPr>
-        <w:pStyle w:val="ListBullet"/>
+        <w:pStyle w:val="Heading2"/>
       </w:pPr>
       <w:r>
-        <w:rPr>
-          <w:rFonts w:ascii="Calibri" w:hAnsi="Calibri"/>
-          <w:sz w:val="22"/>
-        </w:rPr>
-        <w:t>Establishes end-to-end security compliance with role-based access control (RBAC) and complete audit logging for every citizen search.</w:t>
-      </w:r>
-    </w:p>
-    <w:p>
-      <w:pPr>
-        <w:spacing w:before="280" w:after="120"/>
-      </w:pPr>
-      <w:r>
-        <w:rPr>
-          <w:rFonts w:ascii="Calibri" w:hAnsi="Calibri"/>
-          <w:b/>
-          <w:color w:val="1C366E"/>
-          <w:sz w:val="32"/>
-        </w:rPr>
         <w:t>2. Technical Stack</w:t>
       </w:r>
     </w:p>
+    <w:p/>
     <w:p>
       <w:pPr>
-        <w:spacing w:before="200" w:after="80"/>
+        <w:pStyle w:val="Heading3"/>
       </w:pPr>
       <w:r>
-        <w:rPr>
-          <w:rFonts w:ascii="Calibri" w:hAnsi="Calibri"/>
-          <w:b/>
-          <w:color w:val="1E283C"/>
-          <w:sz w:val="26"/>
-        </w:rPr>
         <w:t>Frontend</w:t>
       </w:r>
     </w:p>
     <w:p>
+      <w:r>
+        <w:t>- [x] **React**</w:t>
+      </w:r>
+    </w:p>
+    <w:p/>
+    <w:p>
       <w:pPr>
-        <w:pStyle w:val="ListBullet"/>
+        <w:pStyle w:val="Heading3"/>
       </w:pPr>
       <w:r>
-        <w:rPr>
-          <w:rFonts w:ascii="Calibri" w:hAnsi="Calibri"/>
-          <w:b/>
-          <w:color w:val="00783C"/>
-          <w:sz w:val="22"/>
-        </w:rPr>
-        <w:t>☑ React</w:t>
-      </w:r>
-    </w:p>
-    <w:p>
-      <w:pPr>
-        <w:spacing w:before="200" w:after="80"/>
-      </w:pPr>
-      <w:r>
-        <w:rPr>
-          <w:rFonts w:ascii="Calibri" w:hAnsi="Calibri"/>
-          <w:b/>
-          <w:color w:val="1E283C"/>
-          <w:sz w:val="26"/>
-        </w:rPr>
         <w:t>Backend</w:t>
       </w:r>
     </w:p>
     <w:p>
+      <w:r>
+        <w:t>- [x] **FastAPI**</w:t>
+      </w:r>
+    </w:p>
+    <w:p/>
+    <w:p>
       <w:pPr>
-        <w:pStyle w:val="ListBullet"/>
+        <w:pStyle w:val="Heading3"/>
       </w:pPr>
       <w:r>
-        <w:rPr>
-          <w:rFonts w:ascii="Calibri" w:hAnsi="Calibri"/>
-          <w:b/>
-          <w:color w:val="00783C"/>
-          <w:sz w:val="22"/>
-        </w:rPr>
-        <w:t>☑ FastAPI</w:t>
-      </w:r>
-    </w:p>
-    <w:p>
-      <w:pPr>
-        <w:spacing w:before="200" w:after="80"/>
-      </w:pPr>
-      <w:r>
-        <w:rPr>
-          <w:rFonts w:ascii="Calibri" w:hAnsi="Calibri"/>
-          <w:b/>
-          <w:color w:val="1E283C"/>
-          <w:sz w:val="26"/>
-        </w:rPr>
         <w:t>Database</w:t>
       </w:r>
     </w:p>
     <w:p>
+      <w:r>
+        <w:t>- [x] **PostgreSQL**</w:t>
+      </w:r>
+    </w:p>
+    <w:p/>
+    <w:p>
       <w:pPr>
-        <w:pStyle w:val="ListBullet"/>
+        <w:pStyle w:val="Heading3"/>
       </w:pPr>
       <w:r>
-        <w:rPr>
-          <w:rFonts w:ascii="Calibri" w:hAnsi="Calibri"/>
-          <w:b/>
-          <w:color w:val="00783C"/>
-          <w:sz w:val="22"/>
-        </w:rPr>
-        <w:t>☑ PostgreSQL</w:t>
+        <w:t>AI Models</w:t>
       </w:r>
     </w:p>
     <w:p>
-      <w:pPr>
-        <w:spacing w:before="200" w:after="80"/>
-      </w:pPr>
       <w:r>
-        <w:rPr>
-          <w:rFonts w:ascii="Calibri" w:hAnsi="Calibri"/>
-          <w:b/>
-          <w:color w:val="1E283C"/>
-          <w:sz w:val="26"/>
-        </w:rPr>
-        <w:t>AI Models</w:t>
+        <w:t>YOLOv9 (License Plate End-to-End Detection), fast-alpr (CCT-S-v2 Global OCR), RF-DETR (Vehicle &amp; Pedestrian Object Detection)</w:t>
       </w:r>
     </w:p>
-    <w:tbl>
-      <w:tblPr>
-        <w:tblW w:type="auto" w:w="0"/>
-        <w:tblLook w:firstColumn="1" w:firstRow="1" w:lastColumn="0" w:lastRow="0" w:noHBand="0" w:noVBand="1" w:val="04A0"/>
-      </w:tblPr>
-      <w:tblGrid>
-        <w:gridCol w:w="9936"/>
-      </w:tblGrid>
-      <w:tr>
-        <w:tc>
-          <w:tcPr>
-            <w:tcW w:type="dxa" w:w="9936"/>
-            <w:shd w:val="clear" w:color="auto" w:fill="F8F9FA"/>
-          </w:tcPr>
-          <w:p>
-            <w:pPr>
-              <w:spacing w:before="120" w:after="120"/>
-            </w:pPr>
-            <w:r>
-              <w:rPr>
-                <w:rFonts w:ascii="Segoe UI" w:hAnsi="Segoe UI"/>
-                <w:color w:val="141414"/>
-                <w:sz w:val="21"/>
-              </w:rPr>
-              <w:t>YOLOv9 (License Plate End-to-End Detection), fast-alpr (CCT-S-v2 Global OCR), RF-DETR (Vehicle &amp; Pedestrian Object Detection)</w:t>
-            </w:r>
-          </w:p>
-        </w:tc>
-      </w:tr>
-    </w:tbl>
     <w:p/>
     <w:p>
       <w:pPr>
-        <w:spacing w:before="200" w:after="80"/>
+        <w:pStyle w:val="Heading3"/>
       </w:pPr>
       <w:r>
-        <w:rPr>
-          <w:rFonts w:ascii="Calibri" w:hAnsi="Calibri"/>
-          <w:b/>
-          <w:color w:val="1E283C"/>
-          <w:sz w:val="26"/>
-        </w:rPr>
         <w:t>APIs Used</w:t>
       </w:r>
     </w:p>
-    <w:tbl>
-      <w:tblPr>
-        <w:tblW w:type="auto" w:w="0"/>
-        <w:tblLook w:firstColumn="1" w:firstRow="1" w:lastColumn="0" w:lastRow="0" w:noHBand="0" w:noVBand="1" w:val="04A0"/>
-      </w:tblPr>
-      <w:tblGrid>
-        <w:gridCol w:w="9936"/>
-      </w:tblGrid>
-      <w:tr>
-        <w:tc>
-          <w:tcPr>
-            <w:tcW w:type="dxa" w:w="9936"/>
-            <w:shd w:val="clear" w:color="auto" w:fill="F8F9FA"/>
-          </w:tcPr>
-          <w:p>
-            <w:pPr>
-              <w:spacing w:before="120" w:after="120"/>
-            </w:pPr>
-            <w:r>
-              <w:rPr>
-                <w:rFonts w:ascii="Segoe UI" w:hAnsi="Segoe UI"/>
-                <w:color w:val="141414"/>
-                <w:sz w:val="21"/>
-              </w:rPr>
-              <w:t>Sentinel Sandbox RTSP Ingest API, VAHAN Vehicle Registry Adapter API, Leaflet GIS &amp; OSRM Routing API, WebSocket Alerting API</w:t>
-            </w:r>
-          </w:p>
-        </w:tc>
-      </w:tr>
-    </w:tbl>
+    <w:p>
+      <w:r>
+        <w:t>Sentinel Sandbox RTSP Ingest API, VAHAN Vehicle Registry Adapter API, Leaflet GIS &amp; OSRM Routing API, WebSocket Alerting API</w:t>
+      </w:r>
+    </w:p>
     <w:p/>
     <w:p>
       <w:pPr>
-        <w:spacing w:before="200" w:after="80"/>
+        <w:pStyle w:val="Heading3"/>
       </w:pPr>
       <w:r>
-        <w:rPr>
-          <w:rFonts w:ascii="Calibri" w:hAnsi="Calibri"/>
-          <w:b/>
-          <w:color w:val="1E283C"/>
-          <w:sz w:val="26"/>
-        </w:rPr>
         <w:t>Cloud Platform</w:t>
       </w:r>
     </w:p>
     <w:p>
+      <w:r>
+        <w:t>- [x] **On-Premise** (or select **Other**: Local Edge Stack with Cloudflare Tunnel)</w:t>
+      </w:r>
+    </w:p>
+    <w:p/>
+    <w:p>
       <w:pPr>
-        <w:pStyle w:val="ListBullet"/>
+        <w:pStyle w:val="Heading3"/>
       </w:pPr>
       <w:r>
-        <w:rPr>
-          <w:rFonts w:ascii="Calibri" w:hAnsi="Calibri"/>
-          <w:b/>
-          <w:color w:val="00783C"/>
-          <w:sz w:val="22"/>
-        </w:rPr>
-        <w:t>☑ On-Premise (or select Other: Local Edge Stack with Cloudflare Tunnel)</w:t>
+        <w:t>Programming Languages</w:t>
       </w:r>
     </w:p>
     <w:p>
-      <w:pPr>
-        <w:spacing w:before="200" w:after="80"/>
-      </w:pPr>
       <w:r>
-        <w:rPr>
-          <w:rFonts w:ascii="Calibri" w:hAnsi="Calibri"/>
-          <w:b/>
-          <w:color w:val="1E283C"/>
-          <w:sz w:val="26"/>
-        </w:rPr>
-        <w:t>Programming Languages</w:t>
+        <w:t>Python, TypeScript, JavaScript, SQL, HTML, CSS</w:t>
       </w:r>
     </w:p>
-    <w:tbl>
-      <w:tblPr>
-        <w:tblW w:type="auto" w:w="0"/>
-        <w:tblLook w:firstColumn="1" w:firstRow="1" w:lastColumn="0" w:lastRow="0" w:noHBand="0" w:noVBand="1" w:val="04A0"/>
-      </w:tblPr>
-      <w:tblGrid>
-        <w:gridCol w:w="9936"/>
-      </w:tblGrid>
-      <w:tr>
-        <w:tc>
-          <w:tcPr>
-            <w:tcW w:type="dxa" w:w="9936"/>
-            <w:shd w:val="clear" w:color="auto" w:fill="F8F9FA"/>
-          </w:tcPr>
-          <w:p>
-            <w:pPr>
-              <w:spacing w:before="120" w:after="120"/>
-            </w:pPr>
-            <w:r>
-              <w:rPr>
-                <w:rFonts w:ascii="Segoe UI" w:hAnsi="Segoe UI"/>
-                <w:color w:val="141414"/>
-                <w:sz w:val="21"/>
-              </w:rPr>
-              <w:t>Python, TypeScript, JavaScript, SQL, HTML, CSS</w:t>
-            </w:r>
-          </w:p>
-        </w:tc>
-      </w:tr>
-    </w:tbl>
     <w:p/>
     <w:p>
       <w:pPr>
-        <w:spacing w:before="200" w:after="80"/>
+        <w:pStyle w:val="Heading3"/>
       </w:pPr>
       <w:r>
-        <w:rPr>
-          <w:rFonts w:ascii="Calibri" w:hAnsi="Calibri"/>
-          <w:b/>
-          <w:color w:val="1E283C"/>
-          <w:sz w:val="26"/>
-        </w:rPr>
         <w:t>Frameworks</w:t>
       </w:r>
     </w:p>
-    <w:tbl>
-      <w:tblPr>
-        <w:tblW w:type="auto" w:w="0"/>
-        <w:tblLook w:firstColumn="1" w:firstRow="1" w:lastColumn="0" w:lastRow="0" w:noHBand="0" w:noVBand="1" w:val="04A0"/>
-      </w:tblPr>
-      <w:tblGrid>
-        <w:gridCol w:w="9936"/>
-      </w:tblGrid>
-      <w:tr>
-        <w:tc>
-          <w:tcPr>
-            <w:tcW w:type="dxa" w:w="9936"/>
-            <w:shd w:val="clear" w:color="auto" w:fill="F8F9FA"/>
-          </w:tcPr>
-          <w:p>
-            <w:pPr>
-              <w:spacing w:before="120" w:after="120"/>
-            </w:pPr>
-            <w:r>
-              <w:rPr>
-                <w:rFonts w:ascii="Segoe UI" w:hAnsi="Segoe UI"/>
-                <w:color w:val="141414"/>
-                <w:sz w:val="21"/>
-              </w:rPr>
-              <w:t>FastAPI, React, PyTorch, OpenCV, ONNX Runtime, Leaflet.js, SQLAlchemy, Pydantic</w:t>
-            </w:r>
-          </w:p>
-        </w:tc>
-      </w:tr>
-    </w:tbl>
+    <w:p>
+      <w:r>
+        <w:t>FastAPI, React, PyTorch, OpenCV, ONNX Runtime, Leaflet.js, SQLAlchemy, Pydantic</w:t>
+      </w:r>
+    </w:p>
     <w:p/>
     <w:p>
       <w:pPr>
-        <w:spacing w:before="200" w:after="80"/>
+        <w:pStyle w:val="Heading3"/>
       </w:pPr>
       <w:r>
-        <w:rPr>
-          <w:rFonts w:ascii="Calibri" w:hAnsi="Calibri"/>
-          <w:b/>
-          <w:color w:val="1E283C"/>
-          <w:sz w:val="26"/>
-        </w:rPr>
         <w:t>Other Tools</w:t>
       </w:r>
     </w:p>
-    <w:tbl>
-      <w:tblPr>
-        <w:tblW w:type="auto" w:w="0"/>
-        <w:tblLook w:firstColumn="1" w:firstRow="1" w:lastColumn="0" w:lastRow="0" w:noHBand="0" w:noVBand="1" w:val="04A0"/>
-      </w:tblPr>
-      <w:tblGrid>
-        <w:gridCol w:w="9936"/>
-      </w:tblGrid>
-      <w:tr>
-        <w:tc>
-          <w:tcPr>
-            <w:tcW w:type="dxa" w:w="9936"/>
-            <w:shd w:val="clear" w:color="auto" w:fill="F8F9FA"/>
-          </w:tcPr>
-          <w:p>
-            <w:pPr>
-              <w:spacing w:before="120" w:after="120"/>
-            </w:pPr>
-            <w:r>
-              <w:rPr>
-                <w:rFonts w:ascii="Segoe UI" w:hAnsi="Segoe UI"/>
-                <w:color w:val="141414"/>
-                <w:sz w:val="21"/>
-              </w:rPr>
-              <w:t>Docker, GitHub, Uvicorn, Vite, PostgreSQL / Supabase, Pydantic-Settings</w:t>
-            </w:r>
-          </w:p>
-        </w:tc>
-      </w:tr>
-    </w:tbl>
+    <w:p>
+      <w:r>
+        <w:t>Docker, GitHub, Uvicorn, Vite, PostgreSQL / Supabase, Pydantic-Settings</w:t>
+      </w:r>
+    </w:p>
+    <w:p/>
+    <w:p>
+      <w:r>
+        <w:t>---</w:t>
+      </w:r>
+    </w:p>
     <w:p/>
     <w:p>
       <w:pPr>
-        <w:spacing w:before="280" w:after="120"/>
+        <w:pStyle w:val="Heading2"/>
       </w:pPr>
       <w:r>
-        <w:rPr>
-          <w:rFonts w:ascii="Calibri" w:hAnsi="Calibri"/>
-          <w:b/>
-          <w:color w:val="1C366E"/>
-          <w:sz w:val="32"/>
-        </w:rPr>
         <w:t>3. Documents &amp; Drive Links</w:t>
       </w:r>
     </w:p>
+    <w:p/>
     <w:p>
       <w:pPr>
-        <w:spacing w:before="200" w:after="80"/>
+        <w:pStyle w:val="Heading3"/>
       </w:pPr>
       <w:r>
-        <w:rPr>
-          <w:rFonts w:ascii="Calibri" w:hAnsi="Calibri"/>
-          <w:b/>
-          <w:color w:val="1E283C"/>
-          <w:sz w:val="26"/>
-        </w:rPr>
         <w:t>Solution Presentation Link *</w:t>
       </w:r>
     </w:p>
-    <w:tbl>
-      <w:tblPr>
-        <w:tblW w:type="auto" w:w="0"/>
-        <w:tblLook w:firstColumn="1" w:firstRow="1" w:lastColumn="0" w:lastRow="0" w:noHBand="0" w:noVBand="1" w:val="04A0"/>
-      </w:tblPr>
-      <w:tblGrid>
-        <w:gridCol w:w="9936"/>
-      </w:tblGrid>
-      <w:tr>
-        <w:tc>
-          <w:tcPr>
-            <w:tcW w:type="dxa" w:w="9936"/>
-            <w:shd w:val="clear" w:color="auto" w:fill="F0F4F8"/>
-          </w:tcPr>
-          <w:p>
-            <w:pPr>
-              <w:spacing w:before="80" w:after="80"/>
-            </w:pPr>
-            <w:r>
-              <w:rPr>
-                <w:rFonts w:ascii="Consolas" w:hAnsi="Consolas"/>
-                <w:color w:val="005AB4"/>
-                <w:sz w:val="20"/>
-              </w:rPr>
-              <w:t>https://drive.google.com/drive/folders/1dfKs9nYNW_KThp3rWlwQcQxe7_c-eQca?usp=drive_link</w:t>
-            </w:r>
-          </w:p>
-        </w:tc>
-      </w:tr>
-    </w:tbl>
+    <w:p>
+      <w:r>
+        <w:t>https://drive.google.com/drive/folders/1dfKs9nYNW_KThp3rWlwQcQxe7_c-eQca?usp=drive_link</w:t>
+      </w:r>
+    </w:p>
     <w:p/>
     <w:p>
       <w:pPr>
-        <w:spacing w:before="200" w:after="80"/>
+        <w:pStyle w:val="Heading3"/>
       </w:pPr>
       <w:r>
-        <w:rPr>
-          <w:rFonts w:ascii="Calibri" w:hAnsi="Calibri"/>
-          <w:b/>
-          <w:color w:val="1E283C"/>
-          <w:sz w:val="26"/>
-        </w:rPr>
         <w:t>High-Level Design / Architecture Document Link *</w:t>
       </w:r>
     </w:p>
-    <w:tbl>
-      <w:tblPr>
-        <w:tblW w:type="auto" w:w="0"/>
-        <w:tblLook w:firstColumn="1" w:firstRow="1" w:lastColumn="0" w:lastRow="0" w:noHBand="0" w:noVBand="1" w:val="04A0"/>
-      </w:tblPr>
-      <w:tblGrid>
-        <w:gridCol w:w="9936"/>
-      </w:tblGrid>
-      <w:tr>
-        <w:tc>
-          <w:tcPr>
-            <w:tcW w:type="dxa" w:w="9936"/>
-            <w:shd w:val="clear" w:color="auto" w:fill="F0F4F8"/>
-          </w:tcPr>
-          <w:p>
-            <w:pPr>
-              <w:spacing w:before="80" w:after="80"/>
-            </w:pPr>
-            <w:r>
-              <w:rPr>
-                <w:rFonts w:ascii="Consolas" w:hAnsi="Consolas"/>
-                <w:color w:val="005AB4"/>
-                <w:sz w:val="20"/>
-              </w:rPr>
-              <w:t>https://drive.google.com/drive/folders/1dfKs9nYNW_KThp3rWlwQcQxe7_c-eQca?usp=drive_link</w:t>
-            </w:r>
-          </w:p>
-        </w:tc>
-      </w:tr>
-    </w:tbl>
+    <w:p>
+      <w:r>
+        <w:t>https://drive.google.com/drive/folders/1dfKs9nYNW_KThp3rWlwQcQxe7_c-eQca?usp=drive_link</w:t>
+      </w:r>
+    </w:p>
     <w:p/>
     <w:p>
       <w:pPr>
-        <w:spacing w:before="200" w:after="80"/>
+        <w:pStyle w:val="Heading3"/>
       </w:pPr>
       <w:r>
-        <w:rPr>
-          <w:rFonts w:ascii="Calibri" w:hAnsi="Calibri"/>
-          <w:b/>
-          <w:color w:val="1E283C"/>
-          <w:sz w:val="26"/>
-        </w:rPr>
         <w:t>Workflow / Integration Diagram Link *</w:t>
       </w:r>
     </w:p>
-    <w:tbl>
-      <w:tblPr>
-        <w:tblW w:type="auto" w:w="0"/>
-        <w:tblLook w:firstColumn="1" w:firstRow="1" w:lastColumn="0" w:lastRow="0" w:noHBand="0" w:noVBand="1" w:val="04A0"/>
-      </w:tblPr>
-      <w:tblGrid>
-        <w:gridCol w:w="9936"/>
-      </w:tblGrid>
-      <w:tr>
-        <w:tc>
-          <w:tcPr>
-            <w:tcW w:type="dxa" w:w="9936"/>
-            <w:shd w:val="clear" w:color="auto" w:fill="F0F4F8"/>
-          </w:tcPr>
-          <w:p>
-            <w:pPr>
-              <w:spacing w:before="80" w:after="80"/>
-            </w:pPr>
-            <w:r>
-              <w:rPr>
-                <w:rFonts w:ascii="Consolas" w:hAnsi="Consolas"/>
-                <w:color w:val="005AB4"/>
-                <w:sz w:val="20"/>
-              </w:rPr>
-              <w:t>https://drive.google.com/drive/folders/1dfKs9nYNW_KThp3rWlwQcQxe7_c-eQca?usp=drive_link</w:t>
-            </w:r>
-          </w:p>
-        </w:tc>
-      </w:tr>
-    </w:tbl>
+    <w:p>
+      <w:r>
+        <w:t>https://drive.google.com/drive/folders/1dfKs9nYNW_KThp3rWlwQcQxe7_c-eQca?usp=drive_link</w:t>
+      </w:r>
+    </w:p>
+    <w:p>
+      <w:r>
+        <w:t>(Or Direct PDF Link: https://raw.githubusercontent.com/DevamShah1211/Sentinel-Hackathone/main/submission/Sentinel-WORKFLOW-DIAGRAM.pdf)</w:t>
+      </w:r>
+    </w:p>
     <w:p/>
     <w:p>
       <w:pPr>
-        <w:spacing w:before="200" w:after="80"/>
+        <w:pStyle w:val="Heading3"/>
       </w:pPr>
       <w:r>
-        <w:rPr>
-          <w:rFonts w:ascii="Calibri" w:hAnsi="Calibri"/>
-          <w:b/>
-          <w:color w:val="1E283C"/>
-          <w:sz w:val="26"/>
-        </w:rPr>
         <w:t>Screenshots Folder Link</w:t>
       </w:r>
     </w:p>
-    <w:tbl>
-      <w:tblPr>
-        <w:tblW w:type="auto" w:w="0"/>
-        <w:tblLook w:firstColumn="1" w:firstRow="1" w:lastColumn="0" w:lastRow="0" w:noHBand="0" w:noVBand="1" w:val="04A0"/>
-      </w:tblPr>
-      <w:tblGrid>
-        <w:gridCol w:w="9936"/>
-      </w:tblGrid>
-      <w:tr>
-        <w:tc>
-          <w:tcPr>
-            <w:tcW w:type="dxa" w:w="9936"/>
-            <w:shd w:val="clear" w:color="auto" w:fill="F0F4F8"/>
-          </w:tcPr>
-          <w:p>
-            <w:pPr>
-              <w:spacing w:before="80" w:after="80"/>
-            </w:pPr>
-            <w:r>
-              <w:rPr>
-                <w:rFonts w:ascii="Consolas" w:hAnsi="Consolas"/>
-                <w:color w:val="005AB4"/>
-                <w:sz w:val="20"/>
-              </w:rPr>
-              <w:t>https://drive.google.com/drive/folders/1dfKs9nYNW_KThp3rWlwQcQxe7_c-eQca?usp=drive_link</w:t>
-            </w:r>
-          </w:p>
-        </w:tc>
-      </w:tr>
-    </w:tbl>
+    <w:p>
+      <w:r>
+        <w:t>https://drive.google.com/drive/folders/1dfKs9nYNW_KThp3rWlwQcQxe7_c-eQca?usp=drive_link</w:t>
+      </w:r>
+    </w:p>
     <w:p/>
     <w:p>
       <w:pPr>
-        <w:spacing w:before="200" w:after="80"/>
+        <w:pStyle w:val="Heading3"/>
       </w:pPr>
       <w:r>
-        <w:rPr>
-          <w:rFonts w:ascii="Calibri" w:hAnsi="Calibri"/>
-          <w:b/>
-          <w:color w:val="1E283C"/>
-          <w:sz w:val="26"/>
-        </w:rPr>
         <w:t>Submit your solution (Video) and paste the Google Drive link</w:t>
       </w:r>
     </w:p>
-    <w:tbl>
-      <w:tblPr>
-        <w:tblW w:type="auto" w:w="0"/>
-        <w:tblLook w:firstColumn="1" w:firstRow="1" w:lastColumn="0" w:lastRow="0" w:noHBand="0" w:noVBand="1" w:val="04A0"/>
-      </w:tblPr>
-      <w:tblGrid>
-        <w:gridCol w:w="9936"/>
-      </w:tblGrid>
-      <w:tr>
-        <w:tc>
-          <w:tcPr>
-            <w:tcW w:type="dxa" w:w="9936"/>
-            <w:shd w:val="clear" w:color="auto" w:fill="F0F4F8"/>
-          </w:tcPr>
-          <w:p>
-            <w:pPr>
-              <w:spacing w:before="80" w:after="80"/>
-            </w:pPr>
-            <w:r>
-              <w:rPr>
-                <w:rFonts w:ascii="Consolas" w:hAnsi="Consolas"/>
-                <w:color w:val="005AB4"/>
-                <w:sz w:val="20"/>
-              </w:rPr>
-              <w:t>https://drive.google.com/drive/folders/1dfKs9nYNW_KThp3rWlwQcQxe7_c-eQca?usp=drive_link</w:t>
-            </w:r>
-          </w:p>
-        </w:tc>
-      </w:tr>
-    </w:tbl>
+    <w:p>
+      <w:r>
+        <w:t>https://drive.google.com/drive/folders/1dfKs9nYNW_KThp3rWlwQcQxe7_c-eQca?usp=drive_link</w:t>
+      </w:r>
+    </w:p>
     <w:p/>
     <w:p>
       <w:pPr>
-        <w:spacing w:before="200" w:after="80"/>
+        <w:pStyle w:val="Heading3"/>
       </w:pPr>
       <w:r>
-        <w:rPr>
-          <w:rFonts w:ascii="Calibri" w:hAnsi="Calibri"/>
-          <w:b/>
-          <w:color w:val="1E283C"/>
-          <w:sz w:val="26"/>
-        </w:rPr>
         <w:t>Any other document or video submission</w:t>
       </w:r>
     </w:p>
-    <w:tbl>
-      <w:tblPr>
-        <w:tblW w:type="auto" w:w="0"/>
-        <w:tblLook w:firstColumn="1" w:firstRow="1" w:lastColumn="0" w:lastRow="0" w:noHBand="0" w:noVBand="1" w:val="04A0"/>
-      </w:tblPr>
-      <w:tblGrid>
-        <w:gridCol w:w="9936"/>
-      </w:tblGrid>
-      <w:tr>
-        <w:tc>
-          <w:tcPr>
-            <w:tcW w:type="dxa" w:w="9936"/>
-            <w:shd w:val="clear" w:color="auto" w:fill="F0F4F8"/>
-          </w:tcPr>
-          <w:p>
-            <w:pPr>
-              <w:spacing w:before="80" w:after="80"/>
-            </w:pPr>
-            <w:r>
-              <w:rPr>
-                <w:rFonts w:ascii="Consolas" w:hAnsi="Consolas"/>
-                <w:color w:val="005AB4"/>
-                <w:sz w:val="20"/>
-              </w:rPr>
-              <w:t>https://github.com/DevamShah1211/Sentinel-Hackathone</w:t>
-            </w:r>
-          </w:p>
-        </w:tc>
-      </w:tr>
-    </w:tbl>
-    <w:p/>
+    <w:p>
+      <w:r>
+        <w:t>https://github.com/DevamShah1211/Sentinel-Hackathone</w:t>
+      </w:r>
+    </w:p>
     <w:sectPr>
       <w:pgSz w:w="12240" w:h="15840"/>
-      <w:pgMar w:top="1152" w:right="1152" w:bottom="1152" w:left="1152" w:header="720" w:footer="720" w:gutter="0"/>
+      <w:pgMar w:top="1440" w:right="1800" w:bottom="1440" w:left="1800" w:header="720" w:footer="720" w:gutter="0"/>
       <w:cols w:space="720"/>
       <w:docGrid w:linePitch="360"/>
     </w:sectPr>

</xml_diff>

<commit_message>
docs: set team name to KodeMatrix and remove all speaker notes from presentation PDF
</commit_message>
<xml_diff>
--- a/submission/FORM_SUBMISSION_FIELD_ANSWERS.docx
+++ b/submission/FORM_SUBMISSION_FIELD_ANSWERS.docx
@@ -28,7 +28,21 @@
         <w:pStyle w:val="Heading2"/>
       </w:pPr>
       <w:r>
-        <w:t>1. Project Description</w:t>
+        <w:t>1. Project &amp; Team Information</w:t>
+      </w:r>
+    </w:p>
+    <w:p/>
+    <w:p>
+      <w:pPr>
+        <w:pStyle w:val="Heading3"/>
+      </w:pPr>
+      <w:r>
+        <w:t>Team Name *</w:t>
+      </w:r>
+    </w:p>
+    <w:p>
+      <w:r>
+        <w:t>KodeMatrix</w:t>
       </w:r>
     </w:p>
     <w:p/>

</xml_diff>